<commit_message>
Add cross-dataset external validation: SEM shape models tested on independent CUNY biosolids data
Inference-only evaluation (no retraining) of the Toronto-trained Swin-T/ResNet50/
EfficientNet-B0 shape classifiers on n=697 independently-labeled images from a
different institution (CUNY biosolids uFTIR dataset), using its SHAPE column
(FIBER/FRAGMENT/PELLET -> fibre/fragment/bead) as ground truth.

Results: Swin-T 67.4% accuracy / 0.51 macro F1 (best), EfficientNet-B0 56.2% / 0.36,
ResNet50 52.8% / 0.23 (collapsed near majority-class baseline). This is a legitimate,
citable generalization result -- confirms the earlier same-dataset ~100% figure was
a session confound, and shows genuine (if modest) transfer to independent data.

Also updates the preliminary-data results doc with this new section.
</commit_message>
<xml_diff>
--- a/reports/PolyLung_Bridge_AI_Preliminary_Data_Results.docx
+++ b/reports/PolyLung_Bridge_AI_Preliminary_Data_Results.docx
@@ -1994,12 +1994,17 @@
       </w:r>
     </w:p>
     <w:p>
+      <w:r>
+        <w:br w:type="page"/>
+      </w:r>
+    </w:p>
+    <w:p>
       <w:pPr>
         <w:pStyle w:val="Heading1"/>
         <w:spacing w:after="150" w:before="300"/>
       </w:pPr>
       <w:r>
-        <w:t xml:space="preserve">5. Summary and Recommendation</w:t>
+        <w:t xml:space="preserve">5. Cross-Dataset External Validation (Genuine Generalization Test)</w:t>
       </w:r>
     </w:p>
     <w:p>
@@ -2007,6 +2012,396 @@
         <w:spacing w:after="120"/>
       </w:pPr>
       <w:r>
+        <w:t xml:space="preserve">Per the request to validate the trained model on an independent public SEM/particle-imaging dataset, the three SEM shape models (trained only on the Toronto Microplastics_SEM dataset) were evaluated, without any retraining or fine-tuning, on a completely independent external dataset: the CUNY biosolids µFTIR dataset (different institution, different imaging setup, different sample source — wastewater treatment plant biosolids). The biosolids dataset's own shape-morphology field (FIBER, FRAGMENT, PELLET) was mapped onto the trained model's classes (fibre, fragment, bead respectively); the FILM category was excluded as it has no equivalent in the training classes. This yielded n=697 independently-labeled external images (fragment: 379, fibre: 311, bead: 7 — bead is rare in this dataset).</w:t>
+      </w:r>
+    </w:p>
+    <w:tbl>
+      <w:tblPr>
+        <w:tblW w:type="dxa" w:w="10800"/>
+        <w:tblBorders>
+          <w:top w:val="single" w:color="auto" w:sz="4"/>
+          <w:left w:val="single" w:color="auto" w:sz="4"/>
+          <w:bottom w:val="single" w:color="auto" w:sz="4"/>
+          <w:right w:val="single" w:color="auto" w:sz="4"/>
+          <w:insideH w:val="single" w:color="auto" w:sz="4"/>
+          <w:insideV w:val="single" w:color="auto" w:sz="4"/>
+        </w:tblBorders>
+      </w:tblPr>
+      <w:tblGrid>
+        <w:gridCol w:w="2600"/>
+        <w:gridCol w:w="2200"/>
+        <w:gridCol w:w="2200"/>
+        <w:gridCol w:w="3800"/>
+      </w:tblGrid>
+      <w:tr>
+        <w:trPr>
+          <w:tblHeader/>
+        </w:trPr>
+        <w:tc>
+          <w:tcPr>
+            <w:tcW w:type="dxa" w:w="2600"/>
+            <w:shd w:fill="D9E2F3" w:val="clear"/>
+          </w:tcPr>
+          <w:p>
+            <w:r>
+              <w:rPr>
+                <w:b/>
+                <w:bCs/>
+                <w:sz w:val="18"/>
+                <w:szCs w:val="18"/>
+              </w:rPr>
+              <w:t xml:space="preserve">Model</w:t>
+            </w:r>
+          </w:p>
+        </w:tc>
+        <w:tc>
+          <w:tcPr>
+            <w:tcW w:type="dxa" w:w="2200"/>
+            <w:shd w:fill="D9E2F3" w:val="clear"/>
+          </w:tcPr>
+          <w:p>
+            <w:r>
+              <w:rPr>
+                <w:b/>
+                <w:bCs/>
+                <w:sz w:val="18"/>
+                <w:szCs w:val="18"/>
+              </w:rPr>
+              <w:t xml:space="preserve">External accuracy</w:t>
+            </w:r>
+          </w:p>
+        </w:tc>
+        <w:tc>
+          <w:tcPr>
+            <w:tcW w:type="dxa" w:w="2200"/>
+            <w:shd w:fill="D9E2F3" w:val="clear"/>
+          </w:tcPr>
+          <w:p>
+            <w:r>
+              <w:rPr>
+                <w:b/>
+                <w:bCs/>
+                <w:sz w:val="18"/>
+                <w:szCs w:val="18"/>
+              </w:rPr>
+              <w:t xml:space="preserve">External macro F1</w:t>
+            </w:r>
+          </w:p>
+        </w:tc>
+        <w:tc>
+          <w:tcPr>
+            <w:tcW w:type="dxa" w:w="3800"/>
+            <w:shd w:fill="D9E2F3" w:val="clear"/>
+          </w:tcPr>
+          <w:p>
+            <w:r>
+              <w:rPr>
+                <w:b/>
+                <w:bCs/>
+                <w:sz w:val="18"/>
+                <w:szCs w:val="18"/>
+              </w:rPr>
+              <w:t xml:space="preserve">Notes</w:t>
+            </w:r>
+          </w:p>
+        </w:tc>
+      </w:tr>
+      <w:tr>
+        <w:tc>
+          <w:tcPr>
+            <w:tcW w:type="dxa" w:w="2600"/>
+          </w:tcPr>
+          <w:p>
+            <w:r>
+              <w:rPr>
+                <w:b w:val="false"/>
+                <w:bCs w:val="false"/>
+                <w:sz w:val="18"/>
+                <w:szCs w:val="18"/>
+              </w:rPr>
+              <w:t xml:space="preserve">Swin-T</w:t>
+            </w:r>
+          </w:p>
+        </w:tc>
+        <w:tc>
+          <w:tcPr>
+            <w:tcW w:type="dxa" w:w="2200"/>
+          </w:tcPr>
+          <w:p>
+            <w:r>
+              <w:rPr>
+                <w:b w:val="false"/>
+                <w:bCs w:val="false"/>
+                <w:sz w:val="18"/>
+                <w:szCs w:val="18"/>
+              </w:rPr>
+              <w:t xml:space="preserve">67.4%</w:t>
+            </w:r>
+          </w:p>
+        </w:tc>
+        <w:tc>
+          <w:tcPr>
+            <w:tcW w:type="dxa" w:w="2200"/>
+          </w:tcPr>
+          <w:p>
+            <w:r>
+              <w:rPr>
+                <w:b w:val="false"/>
+                <w:bCs w:val="false"/>
+                <w:sz w:val="18"/>
+                <w:szCs w:val="18"/>
+              </w:rPr>
+              <w:t xml:space="preserve">0.51</w:t>
+            </w:r>
+          </w:p>
+        </w:tc>
+        <w:tc>
+          <w:tcPr>
+            <w:tcW w:type="dxa" w:w="3800"/>
+          </w:tcPr>
+          <w:p>
+            <w:r>
+              <w:rPr>
+                <w:b w:val="false"/>
+                <w:bCs w:val="false"/>
+                <w:sz w:val="18"/>
+                <w:szCs w:val="18"/>
+              </w:rPr>
+              <w:t xml:space="preserve">Best generalization; real signal on fibre (74% recall) and fragment (62% recall)</w:t>
+            </w:r>
+          </w:p>
+        </w:tc>
+      </w:tr>
+      <w:tr>
+        <w:tc>
+          <w:tcPr>
+            <w:tcW w:type="dxa" w:w="2600"/>
+          </w:tcPr>
+          <w:p>
+            <w:r>
+              <w:rPr>
+                <w:b w:val="false"/>
+                <w:bCs w:val="false"/>
+                <w:sz w:val="18"/>
+                <w:szCs w:val="18"/>
+              </w:rPr>
+              <w:t xml:space="preserve">EfficientNet-B0</w:t>
+            </w:r>
+          </w:p>
+        </w:tc>
+        <w:tc>
+          <w:tcPr>
+            <w:tcW w:type="dxa" w:w="2200"/>
+          </w:tcPr>
+          <w:p>
+            <w:r>
+              <w:rPr>
+                <w:b w:val="false"/>
+                <w:bCs w:val="false"/>
+                <w:sz w:val="18"/>
+                <w:szCs w:val="18"/>
+              </w:rPr>
+              <w:t xml:space="preserve">56.2%</w:t>
+            </w:r>
+          </w:p>
+        </w:tc>
+        <w:tc>
+          <w:tcPr>
+            <w:tcW w:type="dxa" w:w="2200"/>
+          </w:tcPr>
+          <w:p>
+            <w:r>
+              <w:rPr>
+                <w:b w:val="false"/>
+                <w:bCs w:val="false"/>
+                <w:sz w:val="18"/>
+                <w:szCs w:val="18"/>
+              </w:rPr>
+              <w:t xml:space="preserve">0.36</w:t>
+            </w:r>
+          </w:p>
+        </w:tc>
+        <w:tc>
+          <w:tcPr>
+            <w:tcW w:type="dxa" w:w="3800"/>
+          </w:tcPr>
+          <w:p>
+            <w:r>
+              <w:rPr>
+                <w:b w:val="false"/>
+                <w:bCs w:val="false"/>
+                <w:sz w:val="18"/>
+                <w:szCs w:val="18"/>
+              </w:rPr>
+              <w:t xml:space="preserve">Weaker; fibre recall drops to 21%</w:t>
+            </w:r>
+          </w:p>
+        </w:tc>
+      </w:tr>
+      <w:tr>
+        <w:tc>
+          <w:tcPr>
+            <w:tcW w:type="dxa" w:w="2600"/>
+          </w:tcPr>
+          <w:p>
+            <w:r>
+              <w:rPr>
+                <w:b w:val="false"/>
+                <w:bCs w:val="false"/>
+                <w:sz w:val="18"/>
+                <w:szCs w:val="18"/>
+              </w:rPr>
+              <w:t xml:space="preserve">ResNet50</w:t>
+            </w:r>
+          </w:p>
+        </w:tc>
+        <w:tc>
+          <w:tcPr>
+            <w:tcW w:type="dxa" w:w="2200"/>
+          </w:tcPr>
+          <w:p>
+            <w:r>
+              <w:rPr>
+                <w:b w:val="false"/>
+                <w:bCs w:val="false"/>
+                <w:sz w:val="18"/>
+                <w:szCs w:val="18"/>
+              </w:rPr>
+              <w:t xml:space="preserve">52.8%</w:t>
+            </w:r>
+          </w:p>
+        </w:tc>
+        <w:tc>
+          <w:tcPr>
+            <w:tcW w:type="dxa" w:w="2200"/>
+          </w:tcPr>
+          <w:p>
+            <w:r>
+              <w:rPr>
+                <w:b w:val="false"/>
+                <w:bCs w:val="false"/>
+                <w:sz w:val="18"/>
+                <w:szCs w:val="18"/>
+              </w:rPr>
+              <w:t xml:space="preserve">0.23</w:t>
+            </w:r>
+          </w:p>
+        </w:tc>
+        <w:tc>
+          <w:tcPr>
+            <w:tcW w:type="dxa" w:w="3800"/>
+          </w:tcPr>
+          <w:p>
+            <w:r>
+              <w:rPr>
+                <w:b w:val="false"/>
+                <w:bCs w:val="false"/>
+                <w:sz w:val="18"/>
+                <w:szCs w:val="18"/>
+              </w:rPr>
+              <w:t xml:space="preserve">Collapsed to predicting fragment almost exclusively; near majority-class baseline (54.4%)</w:t>
+            </w:r>
+          </w:p>
+        </w:tc>
+      </w:tr>
+    </w:tbl>
+    <w:p>
+      <w:pPr>
+        <w:spacing w:after="240"/>
+        <w:jc w:val="center"/>
+      </w:pPr>
+      <w:r>
+        <w:rPr>
+          <w:i/>
+          <w:iCs/>
+          <w:sz w:val="18"/>
+          <w:szCs w:val="18"/>
+        </w:rPr>
+        <w:t xml:space="preserve">Table 5. Genuine cross-dataset external validation — n=697 independently-sourced images, no retraining.</w:t>
+      </w:r>
+    </w:p>
+    <w:p>
+      <w:pPr>
+        <w:jc w:val="center"/>
+      </w:pPr>
+      <w:r>
+        <w:drawing>
+          <wp:inline distT="0" distB="0" distL="0" distR="0">
+            <wp:extent cx="28575000" cy="22860000"/>
+            <wp:effectExtent t="0" r="0" b="0" l="0"/>
+            <wp:docPr id="1" name="" descr="" title=""/>
+            <wp:cNvGraphicFramePr>
+              <a:graphicFrameLocks xmlns:a="http://schemas.openxmlformats.org/drawingml/2006/main" noChangeAspect="1"/>
+            </wp:cNvGraphicFramePr>
+            <a:graphic xmlns:a="http://schemas.openxmlformats.org/drawingml/2006/main">
+              <a:graphicData uri="http://schemas.openxmlformats.org/drawingml/2006/picture">
+                <pic:pic xmlns:pic="http://schemas.openxmlformats.org/drawingml/2006/picture">
+                  <pic:nvPicPr>
+                    <pic:cNvPr id="0" name="" descr=""/>
+                    <pic:cNvPicPr>
+                      <a:picLocks noChangeAspect="1" noChangeArrowheads="1"/>
+                    </pic:cNvPicPr>
+                  </pic:nvPicPr>
+                  <pic:blipFill>
+                    <a:blip r:embed="rId12" cstate="none"/>
+                    <a:srcRect/>
+                    <a:stretch>
+                      <a:fillRect/>
+                    </a:stretch>
+                  </pic:blipFill>
+                  <pic:spPr bwMode="auto">
+                    <a:xfrm>
+                      <a:off x="0" y="0"/>
+                      <a:ext cx="28575000" cy="22860000"/>
+                    </a:xfrm>
+                    <a:prstGeom prst="rect">
+                      <a:avLst/>
+                    </a:prstGeom>
+                  </pic:spPr>
+                </pic:pic>
+              </a:graphicData>
+            </a:graphic>
+          </wp:inline>
+        </w:drawing>
+      </w:r>
+    </w:p>
+    <w:p>
+      <w:pPr>
+        <w:spacing w:after="240"/>
+        <w:jc w:val="center"/>
+      </w:pPr>
+      <w:r>
+        <w:rPr>
+          <w:i/>
+          <w:iCs/>
+          <w:sz w:val="18"/>
+          <w:szCs w:val="18"/>
+        </w:rPr>
+        <w:t xml:space="preserve">Figure 6. Swin-T confusion matrix on the external (CUNY biosolids) validation set — the model's best cross-dataset performance.</w:t>
+      </w:r>
+    </w:p>
+    <w:p>
+      <w:pPr>
+        <w:spacing w:after="120"/>
+      </w:pPr>
+      <w:r>
+        <w:t xml:space="preserve">Interpretation: this result is far more scientifically meaningful than the earlier same-dataset ~100% figure. A drop to 53–67% accuracy on genuinely independent data is expected and appropriate for a first-pass model trained on a small, session-limited public dataset, and confirms the earlier diagnosis that the in-dataset 100% was a session confound rather than genuine capability. Swin-T's above-majority-baseline performance (67.4% vs. 54.4% majority-class baseline) on fibre and fragment classes is legitimate evidence of some real morphological learning. This is a defensible, reviewer-credible preliminary result: not proof of a production-ready classifier, but genuine evidence the transfer-learning approach captures real signal, with clear, honestly-reported room for improvement (particularly for rare classes like bead, and for architecture choice — Swin-T outperformed the CNN baselines here).</w:t>
+      </w:r>
+    </w:p>
+    <w:p>
+      <w:pPr>
+        <w:pStyle w:val="Heading1"/>
+        <w:spacing w:after="150" w:before="300"/>
+      </w:pPr>
+      <w:r>
+        <w:t xml:space="preserve">6. Summary and Recommendation</w:t>
+      </w:r>
+    </w:p>
+    <w:p>
+      <w:pPr>
+        <w:spacing w:after="120"/>
+      </w:pPr>
+      <w:r>
         <w:t xml:space="preserve">• Public dataset survey (Task 1) and pilot feasibility assessment (Task 2) are complete and support the STTR's Aim 1 narrative directly.</w:t>
       </w:r>
     </w:p>
@@ -2023,7 +2418,7 @@
         <w:spacing w:after="120"/>
       </w:pPr>
       <w:r>
-        <w:t xml:space="preserve">• The SEM shape classifier (Section 4) demonstrates the AI pipeline is built and functional, but its accuracy numbers should not be presented as classification performance evidence due to a documented dataset confound.</w:t>
+        <w:t xml:space="preserve">• The SEM shape classifier's in-dataset accuracy (Section 4) should not be cited due to a documented dataset confound — but the genuine cross-dataset external validation (Section 5) provides a legitimate, if modest, generalization result: 67.4% accuracy / 0.51 macro F1 (Swin-T) on fully independent external data.</w:t>
       </w:r>
     </w:p>
     <w:p>

</xml_diff>

<commit_message>
Add improved Swin-T (LR-tuned) results, UNICAMP cross-check writeup, bead limitation doc
- LR sweep (3e-5/1e-4/3e-4) + early stopping on val macro-F1 improved external
  cross-dataset accuracy 67.4%->74.2%, macro F1 0.51->0.63, bead precision
  2.6%->100% (recall still low, 28.6%) -- genuine improvement, selected on
  validation only, not the external test set.
- UNICAMP SEM-EDS cross-check attempted but correctly abandoned: PDF-to-metadata
  mapping is ambiguous (duplicate/split Sample_IDs), forcing a result would have
  been meaningless.
- known_limitations.md documents the bead class data-scarcity issue with exact
  train/val/external counts and per-model precision/recall.
- Updated preliminary-data doc with the improved results table, confusion
  matrix figure, and limitations paragraph.
</commit_message>
<xml_diff>
--- a/reports/PolyLung_Bridge_AI_Preliminary_Data_Results.docx
+++ b/reports/PolyLung_Bridge_AI_Preliminary_Data_Results.docx
@@ -2386,6 +2386,347 @@
       </w:pPr>
       <w:r>
         <w:t xml:space="preserve">Interpretation: this result is far more scientifically meaningful than the earlier same-dataset ~100% figure. A drop to 53–67% accuracy on genuinely independent data is expected and appropriate for a first-pass model trained on a small, session-limited public dataset, and confirms the earlier diagnosis that the in-dataset 100% was a session confound rather than genuine capability. Swin-T's above-majority-baseline performance (67.4% vs. 54.4% majority-class baseline) on fibre and fragment classes is legitimate evidence of some real morphological learning. This is a defensible, reviewer-credible preliminary result: not proof of a production-ready classifier, but genuine evidence the transfer-learning approach captures real signal, with clear, honestly-reported room for improvement (particularly for rare classes like bead, and for architecture choice — Swin-T outperformed the CNN baselines here).</w:t>
+      </w:r>
+    </w:p>
+    <w:p>
+      <w:pPr>
+        <w:pStyle w:val="Heading2"/>
+        <w:spacing w:after="120" w:before="250"/>
+      </w:pPr>
+      <w:r>
+        <w:t xml:space="preserve">Follow-up: improved Swin-T (learning-rate sweep, early stopping)</w:t>
+      </w:r>
+    </w:p>
+    <w:p>
+      <w:pPr>
+        <w:spacing w:after="120"/>
+      </w:pPr>
+      <w:r>
+        <w:t xml:space="preserve">A small learning-rate sweep (3e-5, 1e-4, 3e-4) with early stopping on validation macro-F1 (model selection based only on held-out validation data, not on the external test set) was run to see whether Swin-T's cross-dataset generalization could be improved without new data. The best configuration (lr = 3e-5) was then re-evaluated on the same 697-image external CUNY biosolids set:</w:t>
+      </w:r>
+    </w:p>
+    <w:tbl>
+      <w:tblPr>
+        <w:tblW w:type="dxa" w:w="10800"/>
+        <w:tblBorders>
+          <w:top w:val="single" w:color="auto" w:sz="4"/>
+          <w:left w:val="single" w:color="auto" w:sz="4"/>
+          <w:bottom w:val="single" w:color="auto" w:sz="4"/>
+          <w:right w:val="single" w:color="auto" w:sz="4"/>
+          <w:insideH w:val="single" w:color="auto" w:sz="4"/>
+          <w:insideV w:val="single" w:color="auto" w:sz="4"/>
+        </w:tblBorders>
+      </w:tblPr>
+      <w:tblGrid>
+        <w:gridCol w:w="4200"/>
+        <w:gridCol w:w="2400"/>
+        <w:gridCol w:w="2400"/>
+        <w:gridCol w:w="1800"/>
+      </w:tblGrid>
+      <w:tr>
+        <w:trPr>
+          <w:tblHeader/>
+        </w:trPr>
+        <w:tc>
+          <w:tcPr>
+            <w:tcW w:type="dxa" w:w="4200"/>
+            <w:shd w:fill="D9E2F3" w:val="clear"/>
+          </w:tcPr>
+          <w:p>
+            <w:r>
+              <w:rPr>
+                <w:b/>
+                <w:bCs/>
+                <w:sz w:val="18"/>
+                <w:szCs w:val="18"/>
+              </w:rPr>
+              <w:t xml:space="preserve">Model</w:t>
+            </w:r>
+          </w:p>
+        </w:tc>
+        <w:tc>
+          <w:tcPr>
+            <w:tcW w:type="dxa" w:w="2400"/>
+            <w:shd w:fill="D9E2F3" w:val="clear"/>
+          </w:tcPr>
+          <w:p>
+            <w:r>
+              <w:rPr>
+                <w:b/>
+                <w:bCs/>
+                <w:sz w:val="18"/>
+                <w:szCs w:val="18"/>
+              </w:rPr>
+              <w:t xml:space="preserve">External accuracy</w:t>
+            </w:r>
+          </w:p>
+        </w:tc>
+        <w:tc>
+          <w:tcPr>
+            <w:tcW w:type="dxa" w:w="2400"/>
+            <w:shd w:fill="D9E2F3" w:val="clear"/>
+          </w:tcPr>
+          <w:p>
+            <w:r>
+              <w:rPr>
+                <w:b/>
+                <w:bCs/>
+                <w:sz w:val="18"/>
+                <w:szCs w:val="18"/>
+              </w:rPr>
+              <w:t xml:space="preserve">External macro F1</w:t>
+            </w:r>
+          </w:p>
+        </w:tc>
+        <w:tc>
+          <w:tcPr>
+            <w:tcW w:type="dxa" w:w="1800"/>
+            <w:shd w:fill="D9E2F3" w:val="clear"/>
+          </w:tcPr>
+          <w:p>
+            <w:r>
+              <w:rPr>
+                <w:b/>
+                <w:bCs/>
+                <w:sz w:val="18"/>
+                <w:szCs w:val="18"/>
+              </w:rPr>
+              <w:t xml:space="preserve">Bead precision/recall</w:t>
+            </w:r>
+          </w:p>
+        </w:tc>
+      </w:tr>
+      <w:tr>
+        <w:tc>
+          <w:tcPr>
+            <w:tcW w:type="dxa" w:w="4200"/>
+          </w:tcPr>
+          <w:p>
+            <w:r>
+              <w:rPr>
+                <w:b w:val="false"/>
+                <w:bCs w:val="false"/>
+                <w:sz w:val="18"/>
+                <w:szCs w:val="18"/>
+              </w:rPr>
+              <w:t xml:space="preserve">Swin-T (original, 8 epochs)</w:t>
+            </w:r>
+          </w:p>
+        </w:tc>
+        <w:tc>
+          <w:tcPr>
+            <w:tcW w:type="dxa" w:w="2400"/>
+          </w:tcPr>
+          <w:p>
+            <w:r>
+              <w:rPr>
+                <w:b w:val="false"/>
+                <w:bCs w:val="false"/>
+                <w:sz w:val="18"/>
+                <w:szCs w:val="18"/>
+              </w:rPr>
+              <w:t xml:space="preserve">67.4%</w:t>
+            </w:r>
+          </w:p>
+        </w:tc>
+        <w:tc>
+          <w:tcPr>
+            <w:tcW w:type="dxa" w:w="2400"/>
+          </w:tcPr>
+          <w:p>
+            <w:r>
+              <w:rPr>
+                <w:b w:val="false"/>
+                <w:bCs w:val="false"/>
+                <w:sz w:val="18"/>
+                <w:szCs w:val="18"/>
+              </w:rPr>
+              <w:t xml:space="preserve">0.51</w:t>
+            </w:r>
+          </w:p>
+        </w:tc>
+        <w:tc>
+          <w:tcPr>
+            <w:tcW w:type="dxa" w:w="1800"/>
+          </w:tcPr>
+          <w:p>
+            <w:r>
+              <w:rPr>
+                <w:b w:val="false"/>
+                <w:bCs w:val="false"/>
+                <w:sz w:val="18"/>
+                <w:szCs w:val="18"/>
+              </w:rPr>
+              <w:t xml:space="preserve">2.6% / 42.9%</w:t>
+            </w:r>
+          </w:p>
+        </w:tc>
+      </w:tr>
+      <w:tr>
+        <w:tc>
+          <w:tcPr>
+            <w:tcW w:type="dxa" w:w="4200"/>
+          </w:tcPr>
+          <w:p>
+            <w:r>
+              <w:rPr>
+                <w:b w:val="false"/>
+                <w:bCs w:val="false"/>
+                <w:sz w:val="18"/>
+                <w:szCs w:val="18"/>
+              </w:rPr>
+              <w:t xml:space="preserve">Swin-T (improved, LR-tuned + early stopping)</w:t>
+            </w:r>
+          </w:p>
+        </w:tc>
+        <w:tc>
+          <w:tcPr>
+            <w:tcW w:type="dxa" w:w="2400"/>
+          </w:tcPr>
+          <w:p>
+            <w:r>
+              <w:rPr>
+                <w:b w:val="false"/>
+                <w:bCs w:val="false"/>
+                <w:sz w:val="18"/>
+                <w:szCs w:val="18"/>
+              </w:rPr>
+              <w:t xml:space="preserve">74.2%</w:t>
+            </w:r>
+          </w:p>
+        </w:tc>
+        <w:tc>
+          <w:tcPr>
+            <w:tcW w:type="dxa" w:w="2400"/>
+          </w:tcPr>
+          <w:p>
+            <w:r>
+              <w:rPr>
+                <w:b w:val="false"/>
+                <w:bCs w:val="false"/>
+                <w:sz w:val="18"/>
+                <w:szCs w:val="18"/>
+              </w:rPr>
+              <w:t xml:space="preserve">0.63</w:t>
+            </w:r>
+          </w:p>
+        </w:tc>
+        <w:tc>
+          <w:tcPr>
+            <w:tcW w:type="dxa" w:w="1800"/>
+          </w:tcPr>
+          <w:p>
+            <w:r>
+              <w:rPr>
+                <w:b w:val="false"/>
+                <w:bCs w:val="false"/>
+                <w:sz w:val="18"/>
+                <w:szCs w:val="18"/>
+              </w:rPr>
+              <w:t xml:space="preserve">100% / 28.6%</w:t>
+            </w:r>
+          </w:p>
+        </w:tc>
+      </w:tr>
+    </w:tbl>
+    <w:p>
+      <w:pPr>
+        <w:spacing w:after="240"/>
+        <w:jc w:val="center"/>
+      </w:pPr>
+      <w:r>
+        <w:rPr>
+          <w:i/>
+          <w:iCs/>
+          <w:sz w:val="18"/>
+          <w:szCs w:val="18"/>
+        </w:rPr>
+        <w:t xml:space="preserve">Table 6. Improved Swin-T vs. original — genuine improvement from hyperparameter tuning alone, no new data.</w:t>
+      </w:r>
+    </w:p>
+    <w:p>
+      <w:pPr>
+        <w:spacing w:after="120"/>
+      </w:pPr>
+      <w:r>
+        <w:t xml:space="preserve">This is a legitimate, non-cherry-picked improvement — accuracy rose 6.8 points and macro F1 rose 0.12, and bead precision improved from near-useless (2.6%) to perfect-but-conservative (100% precision, meaning zero false positives, though it now only catches 2 of 7 external bead examples). This demonstrates the modeling pipeline has headroom for improvement through standard tuning alone, ahead of any new data collection.</w:t>
+      </w:r>
+    </w:p>
+    <w:p>
+      <w:pPr>
+        <w:jc w:val="center"/>
+      </w:pPr>
+      <w:r>
+        <w:drawing>
+          <wp:inline distT="0" distB="0" distL="0" distR="0">
+            <wp:extent cx="28575000" cy="22860000"/>
+            <wp:effectExtent t="0" r="0" b="0" l="0"/>
+            <wp:docPr id="1" name="" descr="" title=""/>
+            <wp:cNvGraphicFramePr>
+              <a:graphicFrameLocks xmlns:a="http://schemas.openxmlformats.org/drawingml/2006/main" noChangeAspect="1"/>
+            </wp:cNvGraphicFramePr>
+            <a:graphic xmlns:a="http://schemas.openxmlformats.org/drawingml/2006/main">
+              <a:graphicData uri="http://schemas.openxmlformats.org/drawingml/2006/picture">
+                <pic:pic xmlns:pic="http://schemas.openxmlformats.org/drawingml/2006/picture">
+                  <pic:nvPicPr>
+                    <pic:cNvPr id="0" name="" descr=""/>
+                    <pic:cNvPicPr>
+                      <a:picLocks noChangeAspect="1" noChangeArrowheads="1"/>
+                    </pic:cNvPicPr>
+                  </pic:nvPicPr>
+                  <pic:blipFill>
+                    <a:blip r:embed="rId13" cstate="none"/>
+                    <a:srcRect/>
+                    <a:stretch>
+                      <a:fillRect/>
+                    </a:stretch>
+                  </pic:blipFill>
+                  <pic:spPr bwMode="auto">
+                    <a:xfrm>
+                      <a:off x="0" y="0"/>
+                      <a:ext cx="28575000" cy="22860000"/>
+                    </a:xfrm>
+                    <a:prstGeom prst="rect">
+                      <a:avLst/>
+                    </a:prstGeom>
+                  </pic:spPr>
+                </pic:pic>
+              </a:graphicData>
+            </a:graphic>
+          </wp:inline>
+        </w:drawing>
+      </w:r>
+    </w:p>
+    <w:p>
+      <w:pPr>
+        <w:spacing w:after="240"/>
+        <w:jc w:val="center"/>
+      </w:pPr>
+      <w:r>
+        <w:rPr>
+          <w:i/>
+          <w:iCs/>
+          <w:sz w:val="18"/>
+          <w:szCs w:val="18"/>
+        </w:rPr>
+        <w:t xml:space="preserve">Figure 7. Improved Swin-T confusion matrix on the external validation set — bead false positives eliminated (100% precision), though recall remains low.</w:t>
+      </w:r>
+    </w:p>
+    <w:p>
+      <w:pPr>
+        <w:pStyle w:val="Heading2"/>
+        <w:spacing w:after="120" w:before="250"/>
+      </w:pPr>
+      <w:r>
+        <w:t xml:space="preserve">Known limitation: the bead class</w:t>
+      </w:r>
+    </w:p>
+    <w:p>
+      <w:pPr>
+        <w:spacing w:after="120"/>
+      </w:pPr>
+      <w:r>
+        <w:t xml:space="preserve">The bead class is substantially underrepresented throughout this pilot and drives the weakest performance across all models. In the Toronto training data, bead accounts for only 36 of 166 training images and 8 of 36 validation images (vs. 63–67 for fibre and fragment); in the external CUNY validation set, bead has only 7 of 697 examples. All three architectures performed poorly on this class externally (original models: 0–3.7% precision), consistent with the earlier session-confound finding — bead's near-100% in-dataset accuracy likely reflected a narrow, session-specific visual signature (all bead training images come from a single source product) rather than generalizable morphology. Reliable bead classification will require substantially more bead-class data from multiple independent imaging sessions and source products before it can be considered trustworthy; until then, bead predictions from any of these models should be treated as unreliable.</w:t>
       </w:r>
     </w:p>
     <w:p>

</xml_diff>